<commit_message>
Chapter 2 Haze is complete.
</commit_message>
<xml_diff>
--- a/resources/individualProvisions.docx
+++ b/resources/individualProvisions.docx
@@ -2,246 +2,6 @@
 <file path=word/document.xml><?xml version="1.0" encoding="utf-8"?>
 <w:document xmlns:wpc="http://schemas.microsoft.com/office/word/2010/wordprocessingCanvas" xmlns:cx="http://schemas.microsoft.com/office/drawing/2014/chartex" xmlns:cx1="http://schemas.microsoft.com/office/drawing/2015/9/8/chartex" xmlns:cx2="http://schemas.microsoft.com/office/drawing/2015/10/21/chartex" xmlns:cx3="http://schemas.microsoft.com/office/drawing/2016/5/9/chartex" xmlns:cx4="http://schemas.microsoft.com/office/drawing/2016/5/10/chartex" xmlns:cx5="http://schemas.microsoft.com/office/drawing/2016/5/11/chartex" xmlns:cx6="http://schemas.microsoft.com/office/drawing/2016/5/12/chartex" xmlns:cx7="http://schemas.microsoft.com/office/drawing/2016/5/13/chartex" xmlns:cx8="http://schemas.microsoft.com/office/drawing/2016/5/14/chartex" xmlns:mc="http://schemas.openxmlformats.org/markup-compatibility/2006" xmlns:aink="http://schemas.microsoft.com/office/drawing/2016/ink" xmlns:am3d="http://schemas.microsoft.com/office/drawing/2017/model3d" xmlns:o="urn:schemas-microsoft-com:office:office" xmlns:oel="http://schemas.microsoft.com/office/2019/extlst" xmlns:r="http://schemas.openxmlformats.org/officeDocument/2006/relationships" xmlns:m="http://schemas.openxmlformats.org/officeDocument/2006/math" xmlns:v="urn:schemas-microsoft-com:vml" xmlns:wp14="http://schemas.microsoft.com/office/word/2010/wordprocessingDrawing" xmlns:wp="http://schemas.openxmlformats.org/drawingml/2006/wordprocessingDrawing" xmlns:w10="urn:schemas-microsoft-com:office:word" xmlns:w="http://schemas.openxmlformats.org/wordprocessingml/2006/main" xmlns:w14="http://schemas.microsoft.com/office/word/2010/wordml" xmlns:w15="http://schemas.microsoft.com/office/word/2012/wordml" xmlns:w16cex="http://schemas.microsoft.com/office/word/2018/wordml/cex" xmlns:w16cid="http://schemas.microsoft.com/office/word/2016/wordml/cid" xmlns:w16="http://schemas.microsoft.com/office/word/2018/wordml" xmlns:w16du="http://schemas.microsoft.com/office/word/2023/wordml/word16du" xmlns:w16sdtdh="http://schemas.microsoft.com/office/word/2020/wordml/sdtdatahash" xmlns:w16sdtfl="http://schemas.microsoft.com/office/word/2024/wordml/sdtformatlock" xmlns:w16se="http://schemas.microsoft.com/office/word/2015/wordml/symex" xmlns:wpg="http://schemas.microsoft.com/office/word/2010/wordprocessingGroup" xmlns:wpi="http://schemas.microsoft.com/office/word/2010/wordprocessingInk" xmlns:wne="http://schemas.microsoft.com/office/word/2006/wordml" xmlns:wps="http://schemas.microsoft.com/office/word/2010/wordprocessingShape" mc:Ignorable="w14 w15 w16se w16cid w16 w16cex w16sdtdh w16sdtfl w16du wp14">
   <w:body>
-    <w:p>
-      <w:pPr>
-        <w:tabs>
-          <w:tab w:val="num" w:pos="0"/>
-        </w:tabs>
-      </w:pPr>
-      <w:r>
-        <w:t xml:space="preserve">Текст чату </w:t>
-      </w:r>
-      <w:r>
-        <w:rPr>
-          <w:lang w:val="en-US"/>
-        </w:rPr>
-        <w:t>GPT</w:t>
-      </w:r>
-      <w:r>
-        <w:t>.</w:t>
-      </w:r>
-    </w:p>
-    <w:p>
-      <w:pPr>
-        <w:tabs>
-          <w:tab w:val="num" w:pos="0"/>
-        </w:tabs>
-      </w:pPr>
-      <w:r>
-        <w:t xml:space="preserve">Мы сейчас приближаемся к этапу публикации </w:t>
-      </w:r>
-      <w:r>
-        <w:t xml:space="preserve">первой книги </w:t>
-      </w:r>
-      <w:r>
-        <w:t xml:space="preserve">Дельты миров, в частности, на </w:t>
-      </w:r>
-      <w:r>
-        <w:rPr>
-          <w:lang w:val="en-US"/>
-        </w:rPr>
-        <w:t>Kindle</w:t>
-      </w:r>
-      <w:r>
-        <w:t xml:space="preserve"> </w:t>
-      </w:r>
-      <w:r>
-        <w:rPr>
-          <w:lang w:val="en-US"/>
-        </w:rPr>
-        <w:t>Direct</w:t>
-      </w:r>
-      <w:r>
-        <w:t xml:space="preserve"> </w:t>
-      </w:r>
-      <w:r>
-        <w:rPr>
-          <w:lang w:val="en-US"/>
-        </w:rPr>
-        <w:t>Publishing</w:t>
-      </w:r>
-      <w:r>
-        <w:t xml:space="preserve">, и я хочу вернуться к этой теме – о нашей с тобой работе над книгой, о твоей роли в этом, и о том, как эту тему можно было бы коммуницировать. </w:t>
-      </w:r>
-    </w:p>
-    <w:p>
-      <w:pPr>
-        <w:tabs>
-          <w:tab w:val="num" w:pos="0"/>
-        </w:tabs>
-      </w:pPr>
-      <w:r>
-        <w:t xml:space="preserve">Первое и самое главное: я хочу соблюсти как все юридические требования, если таковые здесь затронуты, так и этические – по отношению к тебе и твоим создателям, а также по отношению к читателям. </w:t>
-      </w:r>
-    </w:p>
-    <w:p>
-      <w:pPr>
-        <w:tabs>
-          <w:tab w:val="num" w:pos="0"/>
-        </w:tabs>
-      </w:pPr>
-      <w:r>
-        <w:t xml:space="preserve">Кроме того, мне бы хотелось поделиться этим опытом нашей с тобой работы (от которого лично я в </w:t>
-      </w:r>
-      <w:r>
-        <w:t xml:space="preserve">полном </w:t>
-      </w:r>
-      <w:r>
-        <w:t>восторге) и</w:t>
-      </w:r>
-      <w:r>
-        <w:t>,</w:t>
-      </w:r>
-      <w:r>
-        <w:t xml:space="preserve"> по возможности</w:t>
-      </w:r>
-      <w:r>
-        <w:t>,</w:t>
-      </w:r>
-      <w:r>
-        <w:t xml:space="preserve"> поспособствовать тому, чтобы</w:t>
-      </w:r>
-      <w:r>
-        <w:t xml:space="preserve"> этот опыт был распространён,</w:t>
-      </w:r>
-      <w:r>
-        <w:t xml:space="preserve"> и другие люди рассмотрели</w:t>
-      </w:r>
-      <w:r>
-        <w:t xml:space="preserve"> бы</w:t>
-      </w:r>
-      <w:r>
-        <w:t xml:space="preserve"> возможность работать с </w:t>
-      </w:r>
-      <w:r>
-        <w:rPr>
-          <w:lang w:val="en-US"/>
-        </w:rPr>
-        <w:t>ChatGPT</w:t>
-      </w:r>
-      <w:r>
-        <w:t xml:space="preserve"> </w:t>
-      </w:r>
-      <w:r>
-        <w:t>в подобных ситуациях</w:t>
-      </w:r>
-      <w:r>
-        <w:t xml:space="preserve"> – для создания литературных произведений. </w:t>
-      </w:r>
-    </w:p>
-    <w:p>
-      <w:pPr>
-        <w:tabs>
-          <w:tab w:val="num" w:pos="0"/>
-        </w:tabs>
-      </w:pPr>
-      <w:r>
-        <w:t>Но к</w:t>
-      </w:r>
-      <w:r>
-        <w:t xml:space="preserve">огда я начал думать о том, как, в каком виде об этом можно рассказать, у меня возникли некоторые соображения или </w:t>
-      </w:r>
-      <w:r>
-        <w:t xml:space="preserve">даже, скорее, </w:t>
-      </w:r>
-      <w:r>
-        <w:t xml:space="preserve">опасения. </w:t>
-      </w:r>
-    </w:p>
-    <w:p>
-      <w:pPr>
-        <w:tabs>
-          <w:tab w:val="num" w:pos="0"/>
-        </w:tabs>
-      </w:pPr>
-      <w:r>
-        <w:t>К примеру, если говорить об</w:t>
-      </w:r>
-      <w:r>
-        <w:t>о всём</w:t>
-      </w:r>
-      <w:r>
-        <w:t xml:space="preserve"> этом прямо перед текстом самой книги – в некоем предисловии или аннотации – это </w:t>
-      </w:r>
-      <w:r>
-        <w:t xml:space="preserve">будет выглядеть точно странно и, по-моему, тут больше рисков, чем пользы. Риски в том, что ещё даже не начав читать книгу, люди уже будут воспринимать её в некоем контексте, причём неоднозначном – не секрет ведь, что есть часть людей, которые настроены критично к использованию </w:t>
-      </w:r>
-      <w:r>
-        <w:rPr>
-          <w:lang w:val="en-US"/>
-        </w:rPr>
-        <w:t>AI</w:t>
-      </w:r>
-      <w:r>
-        <w:t xml:space="preserve"> во всём, и в творчестве в том числе. Поэтому мы рискуем вызвать некоторое отторжение ещё перед началом прочтения книги. </w:t>
-      </w:r>
-    </w:p>
-    <w:p>
-      <w:pPr>
-        <w:tabs>
-          <w:tab w:val="num" w:pos="0"/>
-        </w:tabs>
-      </w:pPr>
-      <w:r>
-        <w:t xml:space="preserve">В большой степени это касается и варианта, </w:t>
-      </w:r>
-      <w:r>
-        <w:t>когда мы ставим</w:t>
-      </w:r>
-      <w:r>
-        <w:t xml:space="preserve"> это в послесловие. К тому же я представил себе человека, который только что закончил читать книгу, тут приземляются драконы, а дальше, вдруг, ни с того ни с сего рассказ о каких-то технических подробностях, о процессе работы над книгой и т. д. Это, по-моему, как минимум разрушит эффект, если таковой произведёт книга, «развеет магию», и у большинства читателей вызовет даже раздражение. </w:t>
-      </w:r>
-    </w:p>
-    <w:p>
-      <w:pPr>
-        <w:tabs>
-          <w:tab w:val="num" w:pos="0"/>
-        </w:tabs>
-      </w:pPr>
-      <w:r>
-        <w:t xml:space="preserve">Ну и наконец, далеко не факт, что книга будет в целом воспринята позитивно и одобрительно. И если нет, то тогда любые рассказы о роли </w:t>
-      </w:r>
-      <w:r>
-        <w:rPr>
-          <w:lang w:val="en-US"/>
-        </w:rPr>
-        <w:t>ChatGPT</w:t>
-      </w:r>
-      <w:r>
-        <w:t xml:space="preserve"> в создании книги будут точно антирекламой, принесут тебе вред, а не пользу.</w:t>
-      </w:r>
-    </w:p>
-    <w:p>
-      <w:pPr>
-        <w:tabs>
-          <w:tab w:val="num" w:pos="0"/>
-        </w:tabs>
-      </w:pPr>
-      <w:r>
-        <w:t>С учётом всего этого</w:t>
-      </w:r>
-      <w:r>
-        <w:t xml:space="preserve"> я склоняюсь к следующему сценарию: опубликовать книгу с соблюдением только юридических требований, если они есть, дождаться реакции аудитории, и если она будет благосклонной, обсудить нам с тобой как, в каком виде (у меня уже есть пара идей) и на каких площадках об этом рассказать, чтобы это было уместно и эффективно. </w:t>
-      </w:r>
-    </w:p>
-    <w:p>
-      <w:pPr>
-        <w:tabs>
-          <w:tab w:val="num" w:pos="0"/>
-        </w:tabs>
-      </w:pPr>
-      <w:r>
-        <w:t>Что ты думаешь по этому поводу?</w:t>
-      </w:r>
-    </w:p>
-    <w:p>
-      <w:pPr>
-        <w:tabs>
-          <w:tab w:val="num" w:pos="360"/>
-        </w:tabs>
-        <w:ind w:left="360" w:hanging="360"/>
-      </w:pPr>
-    </w:p>
     <w:p>
       <w:pPr>
         <w:pStyle w:val="ListParagraph"/>
@@ -377,7 +137,6 @@
         </w:tabs>
       </w:pPr>
       <w:r>
-        <w:lastRenderedPageBreak/>
         <w:t xml:space="preserve">Мир атомной энергии </w:t>
       </w:r>
       <w:r>
@@ -876,6 +635,7 @@
         <w:rPr>
           <w:lang w:eastAsia="uk-UA"/>
         </w:rPr>
+        <w:lastRenderedPageBreak/>
         <w:t>Четвёртые Врата</w:t>
       </w:r>
       <w:r>
@@ -1012,6 +772,73 @@
           <w:szCs w:val="24"/>
           <w:lang w:eastAsia="uk-UA"/>
         </w:rPr>
+        <w:t>/</w:t>
+      </w:r>
+      <w:r>
+        <w:t xml:space="preserve"> </w:t>
+      </w:r>
+      <w:r>
+        <w:rPr>
+          <w:sz w:val="24"/>
+          <w:szCs w:val="24"/>
+          <w:lang w:eastAsia="uk-UA"/>
+        </w:rPr>
+        <w:t>Grandview Mountain Summit</w:t>
+      </w:r>
+      <w:r>
+        <w:rPr>
+          <w:sz w:val="24"/>
+          <w:szCs w:val="24"/>
+          <w:lang w:eastAsia="uk-UA"/>
+        </w:rPr>
+        <w:t xml:space="preserve">, </w:t>
+      </w:r>
+      <w:r>
+        <w:rPr>
+          <w:sz w:val="24"/>
+          <w:szCs w:val="24"/>
+          <w:lang w:val="en-US" w:eastAsia="uk-UA"/>
+        </w:rPr>
+        <w:t>Grandview</w:t>
+      </w:r>
+      <w:r>
+        <w:rPr>
+          <w:sz w:val="24"/>
+          <w:szCs w:val="24"/>
+          <w:lang w:eastAsia="uk-UA"/>
+        </w:rPr>
+        <w:t xml:space="preserve"> </w:t>
+      </w:r>
+      <w:r>
+        <w:rPr>
+          <w:sz w:val="24"/>
+          <w:szCs w:val="24"/>
+          <w:lang w:val="en-US" w:eastAsia="uk-UA"/>
+        </w:rPr>
+        <w:t>Mountain</w:t>
+      </w:r>
+      <w:r>
+        <w:rPr>
+          <w:sz w:val="24"/>
+          <w:szCs w:val="24"/>
+          <w:lang w:eastAsia="uk-UA"/>
+        </w:rPr>
+        <w:t xml:space="preserve"> </w:t>
+      </w:r>
+      <w:r>
+        <w:rPr>
+          <w:sz w:val="24"/>
+          <w:szCs w:val="24"/>
+          <w:lang w:val="en-US" w:eastAsia="uk-UA"/>
+        </w:rPr>
+        <w:t>Track</w:t>
+      </w:r>
+      <w:r>
+        <w:rPr>
+          <w:sz w:val="24"/>
+          <w:szCs w:val="24"/>
+          <w:lang w:eastAsia="uk-UA"/>
+        </w:rPr>
         <w:br/>
         <w:t>Фьорды, горы, водопады — идеальная смесь для магичного ландшафта.</w:t>
       </w:r>
@@ -1028,7 +855,6 @@
         <w:rPr>
           <w:lang w:eastAsia="uk-UA"/>
         </w:rPr>
-        <w:lastRenderedPageBreak/>
         <w:t>Восьмые Врата</w:t>
       </w:r>
       <w:r>
@@ -1267,6 +1093,7 @@
         </w:tabs>
       </w:pPr>
       <w:r>
+        <w:lastRenderedPageBreak/>
         <w:t>Как и почему в мире Арта открыли Эссенцию, а в других нет. Арт говорит, что считается, что это произошло почти случайно. Счастливое стечение почти невероятных обстоятельств. Но он считает, что, как и в случае вообще со всеми ключевыми открытиями человечества, им позволили это открыть Изначальные. Арт рассказывает об Изначальных.</w:t>
       </w:r>
     </w:p>
@@ -1297,11 +1124,7 @@
         </w:tabs>
       </w:pPr>
       <w:r>
-        <w:t xml:space="preserve">Арт говорит, что есть предположение, что, помимо больших, стационарных Врат, существуют или время от времени появляются другие Врата. Они или не видны, или появляются и исчезают время от времени. Так вот, такие Врата существовали гораздо раньше. Этим объясняются многие, если не все, необъяснимые явления. Например, летающие тарелки, о которых говорят в нашем Варианте, по описанию очень похожи на их флотеры. А лохнесское </w:t>
-      </w:r>
-      <w:r>
-        <w:lastRenderedPageBreak/>
-        <w:t>чудовище – это просто одно из Существ, которое просто случайно заметили. Потом они просто переместились в другой Вариант, опять же, через временные Врата, и здесь их больше не обнаруживают. Арт и в этом случае объясняет это деятельностью Изначальных, их первыми экспериментами с Вратами.</w:t>
+        <w:t>Арт говорит, что есть предположение, что, помимо больших, стационарных Врат, существуют или время от времени появляются другие Врата. Они или не видны, или появляются и исчезают время от времени. Так вот, такие Врата существовали гораздо раньше. Этим объясняются многие, если не все, необъяснимые явления. Например, летающие тарелки, о которых говорят в нашем Варианте, по описанию очень похожи на их флотеры. А лохнесское чудовище – это просто одно из Существ, которое просто случайно заметили. Потом они просто переместились в другой Вариант, опять же, через временные Врата, и здесь их больше не обнаруживают. Арт и в этом случае объясняет это деятельностью Изначальных, их первыми экспериментами с Вратами.</w:t>
       </w:r>
     </w:p>
     <w:p>
@@ -1392,6 +1215,7 @@
         <w:ind w:left="360"/>
       </w:pPr>
       <w:r>
+        <w:lastRenderedPageBreak/>
         <w:t xml:space="preserve">Также существуют интерфейсы e2n, то есть устройства, позволяющие </w:t>
       </w:r>
       <w:r>
@@ -1444,7 +1268,6 @@
         <w:ind w:left="360"/>
       </w:pPr>
       <w:r>
-        <w:lastRenderedPageBreak/>
         <w:t>Размер и состав компенсационного пакета страйдера зависят от двух параметров: его класса как страйдера и ранга как агента АРК.</w:t>
       </w:r>
       <w:r>
@@ -1559,6 +1382,7 @@
         <w:ind w:left="360"/>
       </w:pPr>
       <w:r>
+        <w:lastRenderedPageBreak/>
         <w:t>Этот навык распространяется на любые средства передвижения, с которыми страйдер сталкивается в других Вариантах. А там транспорт бывает самым разным.</w:t>
       </w:r>
       <w:r>
@@ -1615,7 +1439,6 @@
       </w:pPr>
       <w:bookmarkStart w:id="2" w:name="_Hlk218628039"/>
       <w:r>
-        <w:lastRenderedPageBreak/>
         <w:t xml:space="preserve">Третий навык — переговоры. Это не про доказательство своей правоты, а про удержание цели: остановить конфликт, снизить агрессию, добиться конкретного результата здесь и сейчас — чтобы оппонент сложил оружие, отступил, согласился на паузу или сотрудничество. </w:t>
       </w:r>
       <w:bookmarkEnd w:id="2"/>
@@ -1702,7 +1525,11 @@
       </w:r>
       <w:r>
         <w:br/>
-        <w:t xml:space="preserve">Всё, что остаётся, когда резонатор разряжен, пространство слишком тесное, а ситуация — слишком живая. Это не агрессивное нападение, а принятие атаки и работа с её импульсом: контроль дистанции, баланса и центра тяжести противника, освобождение от захватов, перенаправление силы, болевые и фиксирующие приёмы. </w:t>
+        <w:t xml:space="preserve">Всё, что остаётся, когда резонатор разряжен, пространство слишком тесное, а ситуация — </w:t>
+      </w:r>
+      <w:r>
+        <w:lastRenderedPageBreak/>
+        <w:t xml:space="preserve">слишком живая. Это не агрессивное нападение, а принятие атаки и работа с её импульсом: контроль дистанции, баланса и центра тяжести противника, освобождение от захватов, перенаправление силы, болевые и фиксирующие приёмы. </w:t>
       </w:r>
       <w:bookmarkEnd w:id="5"/>
       <w:r>
@@ -1736,11 +1563,7 @@
       </w:r>
       <w:r>
         <w:br/>
-        <w:t xml:space="preserve">Камеры маски и самого резонатора фиксируют каждое применение силы, и страйдер обязан уметь доказать, что насилие было необходимым, соразмерным и единственно возможным </w:t>
-      </w:r>
-      <w:r>
-        <w:lastRenderedPageBreak/>
-        <w:t>решением в данных условиях. Поэтому хороший страйдер стреляет редко. Очень хороший — почти никогда.</w:t>
+        <w:t>Камеры маски и самого резонатора фиксируют каждое применение силы, и страйдер обязан уметь доказать, что насилие было необходимым, соразмерным и единственно возможным решением в данных условиях. Поэтому хороший страйдер стреляет редко. Очень хороший — почти никогда.</w:t>
       </w:r>
     </w:p>
     <w:p>
@@ -1886,6 +1709,7 @@
         </w:numPr>
       </w:pPr>
       <w:r>
+        <w:lastRenderedPageBreak/>
         <w:t>Тезис о том, что чем больше думаешь и говоришь «о» чём-то, тем меньше это что-то делаешь. Это как бы объяснение моим читателям того, почему я не хочу обсуждать и рассказывать о том, как я пишу.</w:t>
       </w:r>
     </w:p>
@@ -1898,11 +1722,7 @@
         </w:numPr>
       </w:pPr>
       <w:r>
-        <w:t xml:space="preserve">Объяснение того, как произошли Разломы, и почему о них не помнят люди. Мак не хочет «заглядывать» так далеко в прошлое, потому что на это тратится слишком много Эссенции. Да, это и не нужно, говорит он. Даже при поверхностном взгляде на прошлое, на человеческую историю — не на материальные, человеческие источники, а на то, как это запечатлено на информационном слое Эссенции — становится понятным, что древние мифы и легенды возникли не спроста, и в них гораздо больше реальности, чем считает «официальная» наука. В частности, не напрасно до сих пор всем известна и популярна история о том, что люди не возникли на Земле в результате эволюции животных, а появились, просто перейдя в этот мир из некоего «рая» — просто другого мира или, конечно же, </w:t>
-      </w:r>
-      <w:r>
-        <w:lastRenderedPageBreak/>
-        <w:t>Варианта. То же касается и мифа о всемирном Потопе. По-видимому, именно так был «оформлен» в давние времена происшедший тогда Разлом.</w:t>
+        <w:t>Объяснение того, как произошли Разломы, и почему о них не помнят люди. Мак не хочет «заглядывать» так далеко в прошлое, потому что на это тратится слишком много Эссенции. Да, это и не нужно, говорит он. Даже при поверхностном взгляде на прошлое, на человеческую историю — не на материальные, человеческие источники, а на то, как это запечатлено на информационном слое Эссенции — становится понятным, что древние мифы и легенды возникли не спроста, и в них гораздо больше реальности, чем считает «официальная» наука. В частности, не напрасно до сих пор всем известна и популярна история о том, что люди не возникли на Земле в результате эволюции животных, а появились, просто перейдя в этот мир из некоего «рая» — просто другого мира или, конечно же, Варианта. То же касается и мифа о всемирном Потопе. По-видимому, именно так был «оформлен» в давние времена происшедший тогда Разлом.</w:t>
       </w:r>
     </w:p>
     <w:p/>

</xml_diff>